<commit_message>
fix(briefings): correct Briefing 01 core position and closing line
Reframe both around consequential AI agent executions authorized
before they run or reach the downstream system.

Co-Authored-By: Claude Opus 5.5 <noreply@anthropic.com>
</commit_message>
<xml_diff>
--- a/briefings-source/Strategic_Intelligence_Briefing_01.docx
+++ b/briefings-source/Strategic_Intelligence_Briefing_01.docx
@@ -244,7 +244,7 @@
                 <w:color w:val="F5F5F5"/>
                 <w:sz w:val="24"/>
               </w:rPr>
-              <w:t>The authority problem is the gap between knowing AI was used and proving the AI shaped</w:t>
+              <w:t>The authority problem is the gap between knowing AI was used and proving a consequential AI agent execution</w:t>
             </w:r>
             <w:r>
               <w:rPr>
@@ -254,7 +254,7 @@
                 <w:sz w:val="24"/>
               </w:rPr>
               <w:br/>
-              <w:t>decision path was permitted to move forward.</w:t>
+              <w:t>was authorized before it ran.</w:t>
             </w:r>
           </w:p>
         </w:tc>
@@ -349,7 +349,7 @@
                 <w:b/>
                 <w:color w:val="C24E00"/>
               </w:rPr>
-              <w:t>The authority problem is the gap between knowing AI was used and proving the AI shaped decision path was permitted to move forward.</w:t>
+              <w:t>The authority problem is the gap between knowing AI was used and proving a consequential AI agent execution was authorized before it ran.</w:t>
             </w:r>
           </w:p>
         </w:tc>
@@ -658,7 +658,7 @@
           <w:b/>
           <w:color w:val="141414"/>
         </w:rPr>
-        <w:t xml:space="preserve"> is not visibility. It is enforceable authority over AI influenced decisions before they create consequence.</w:t>
+        <w:t xml:space="preserve"> is not visibility. It is enforceable authority over consequential AI agent executions before they reach the downstream system.</w:t>
       </w:r>
     </w:p>
     <w:p>

</xml_diff>